<commit_message>
Update to reflect Npcap version 1.88
</commit_message>
<xml_diff>
--- a/docs/Npcap-Third-Party-Open-Source.docx
+++ b/docs/Npcap-Third-Party-Open-Source.docx
@@ -256,7 +256,14 @@
           <w:b/>
           <w:bCs/>
         </w:rPr>
-        <w:t>87</w:t>
+        <w:t>8</w:t>
+      </w:r>
+      <w:r>
+        <w:rPr>
+          <w:b/>
+          <w:bCs/>
+        </w:rPr>
+        <w:t>8</w:t>
       </w:r>
       <w:r>
         <w:t xml:space="preserve">. Licensees or potential licensees who want this information for a different </w:t>
@@ -2427,7 +2434,6 @@
     <w:rPr>
       <w:color w:val="800000"/>
       <w:u w:val="single"/>
-      <w:lang/>
     </w:rPr>
   </w:style>
   <w:style w:type="paragraph" w:customStyle="1" w:styleId="Heading">
@@ -2487,7 +2493,6 @@
     </w:pPr>
     <w:rPr>
       <w:rFonts w:cs="Lucida Sans"/>
-      <w:lang/>
     </w:rPr>
   </w:style>
   <w:style w:type="paragraph" w:customStyle="1" w:styleId="HeaderandFooter">

</xml_diff>